<commit_message>
docs(IT23368248): update group SRS document with Member 04 refined boundaries and verified supervisor details
</commit_message>
<xml_diff>
--- a/IT23368248/docs/J26-CS-330_SRS_Document.docx
+++ b/IT23368248/docs/J26-CS-330_SRS_Document.docx
@@ -252,7 +252,7 @@
               <w:br/>
               <w:t>3. S.M. Dissanayaka (IT23368248) — Component 03</w:t>
               <w:br/>
-              <w:t>4. Sahan Wijerathna (IT23308938) — Component 04</w:t>
+              <w:t>4. Sahan Wijerathna (IT23306936) — Component 04</w:t>
             </w:r>
           </w:p>
         </w:tc>
@@ -296,7 +296,7 @@
               <w:rPr>
                 <w:sz w:val="21"/>
               </w:rPr>
-              <w:t>Prof. / Dr. / Mr. / Ms. [Supervisor Name]</w:t>
+              <w:t>Mr. Kanishka Yapa</w:t>
             </w:r>
           </w:p>
         </w:tc>
@@ -683,6 +683,17 @@
         <w:rPr>
           <w:sz w:val="20"/>
         </w:rPr>
+        <w:t xml:space="preserve">      Component 04 Functional Requirements &amp; Boundaries (C04-FR01 - FR07)</w:t>
+      </w:r>
+    </w:p>
+    <w:p>
+      <w:pPr>
+        <w:spacing w:line="276" w:lineRule="auto" w:after="40"/>
+      </w:pPr>
+      <w:r>
+        <w:rPr>
+          <w:sz w:val="20"/>
+        </w:rPr>
         <w:t xml:space="preserve">   3.3 Performance Requirements</w:t>
       </w:r>
     </w:p>
@@ -842,7 +853,7 @@
         <w:br/>
         <w:t>• Component 03 (S.M. Dissanayaka - IT23368248): Protocol anomaly detection for stealthy Man-in-the-Middle (MITM) attacks targeting ICU MQTT vital telemetry, utilizing Random Forest inference and deterministic cross-layer correlation within sub-1.2 ms.</w:t>
         <w:br/>
-        <w:t>• Component 04 (Sahan Wijerathna - IT23308938): Adaptive SDN zero-touch mitigation and Quality of Service (QoS) monitoring, enforcing dynamic flow blocking and rate-limiting via OpenFlow switches without disrupting life-critical patient sensors.</w:t>
+        <w:t>• Component 04 (Sahan Wijerathna - IT23306936): Safety-constrained adaptive SDN mitigation and QoS monitoring. The current prototype provides alert validation, trusted-context policy decisions, scoped direct-OVS blocking and rate limiting, receiver-side QoS monitoring, bounded reassessment, owned-rule cleanup and a monitoring dashboard. Main live experiments cover controlled DoS flooding; real detector integration, Ryu enforcement and live reconnaissance/MITM evaluation remain planned.</w:t>
       </w:r>
     </w:p>
     <w:p>
@@ -1356,7 +1367,7 @@
     </w:p>
     <w:p>
       <w:r>
-        <w:t>The system interfaces with the Hospital Aggregator Switch via a Switched Port Analyzer (SPAN / Port Mirroring). It connects upstream to the SDN Controller (Ryu) via a dedicated RESTful control channel, enabling decoupled flow rule injection.</w:t>
+        <w:t>The system interfaces with the Hospital Aggregator Switch via a Switched Port Analyzer (SPAN / Port Mirroring). It connects upstream to the SDN Controller (Ryu) via a dedicated RESTful control channel, enabling decoupled flow rule injection. For Component 04, the current testbed uses a direct ovs-ofctl adapter with OpenFlow 1.3; the Ryu REST control path is planned and not claimed as integrated in the current prototype.</w:t>
       </w:r>
     </w:p>
     <w:p>
@@ -1433,7 +1444,7 @@
     </w:p>
     <w:p>
       <w:r>
-        <w:t>The system is strictly designed for edge computing with low memory footprints. The ML inference modules require less than 45 MB of runtime RAM, and the SDN mitigation engine maintains flow state tables using less than 60 MB of system memory.</w:t>
+        <w:t>The system is strictly designed for edge computing with low memory footprints. The ML inference modules require less than 45 MB of runtime RAM, and Component 04 has a proposed mitigation-engine memory target below 60 MB, subject to measurement under a defined workload; this is not a verified current result.</w:t>
       </w:r>
     </w:p>
     <w:p>
@@ -1480,7 +1491,7 @@
         <w:br/>
         <w:t>3. Protocol Anomaly &amp; MITM Confirmation (Component 03): Executes a 4-stage pipeline (IoMT filter -&gt; MQTT filter -&gt; Random Forest inference -&gt; Stage 3.5 deterministic correlation) to detect and confirm stealthy telemetry alterations within 1.15 ms.</w:t>
         <w:br/>
-        <w:t>4. Adaptive SDN Flow Enforcement (Component 04): Receives structured JSON alert signals, calculates rate-limiting meters or drop rules, pushes OpenFlow 1.3 flow-mods to Open vSwitch, and audits sensor delivery windows to maintain 0% packet loss.</w:t>
+        <w:t>4. Adaptive SDN Flow Enforcement (Component 04): Validates structured JSON alerts and evaluates trusted flow, protected-service and fresh QoS context to recommend review, rate_limit or block. A separate direct-OVS enforcer applies scoped OpenFlow 1.3 rules and meters. Receiver-side throughput and UDP loss are assessed against configurable experimental thresholds; no zero-loss or clinical delivery guarantee is claimed. The comparison runner controls scenario actions independently of the alert API, so these experiments do not establish real detector-to-enforcement integration.</w:t>
       </w:r>
     </w:p>
     <w:p>
@@ -1544,7 +1555,7 @@
       <w:r>
         <w:t>• Progress Presentation 1 (Current Milestone): Implementation and demonstration of standalone ML models, interactive web dashboards, deterministic MITM correlation heuristics, and simulated SDN three-host testbeds.</w:t>
         <w:br/>
-        <w:t>• Final Thesis Milestone: Full end-to-end integration between Ryu controller and live detection API, hardware deployment on physical testbeds, and multi-run statistical evaluation under 10+ attack scenarios.</w:t>
+        <w:t>• Final Thesis Milestone: Full end-to-end integration between Ryu controller and live detection API, hardware deployment on physical testbeds, and multi-run statistical evaluation under 10+ attack scenarios. For Component 04, this includes validating a compatible Ryu runtime, integrating real detector alerts, evaluating reconnaissance and MITM mitigation, and extending the topology for proposed rerouting and quarantine. These extensions are planned and require live acceptance evidence.</w:t>
       </w:r>
     </w:p>
     <w:p>
@@ -1610,11 +1621,13 @@
     </w:p>
     <w:p>
       <w:r>
+        <w:t>• SWI-04 (Component 04 Alert Input): POST /alert shall validate required alert fields and payload bounds, reject duplicate accepted IDs within the documented in-memory cache semantics, and obtain protected-service and trusted flow/QoS context. The response shall report a recommendation, reason and applicable scope. Acceptance or recommendation alone shall not execute switch commands. Detector authentication and a real detector alert contract remain integration requirements.</w:t>
+        <w:br/>
         <w:t>• SWI-01 (Prediction Endpoint): POST /predict — Accepts flow JSON features, executes Stages 1 through 3.5, and returns structured prediction JSON containing 'anomaly_score', 'mitm_confirmation_status', and 'action_recommended'.</w:t>
         <w:br/>
         <w:t>• SWI-02 (Alert Endpoint): GET /alerts — Returns recent timestamped threat alerts for UI consumption.</w:t>
         <w:br/>
-        <w:t>• SWI-03 (SDN Controller API): REST interface to Ryu controller enabling automated meter creation and flow rule injection.</w:t>
+        <w:t>• SWI-03 (SDN Controller API): Planned REST interface to a Ryu controller for meter creation and flow rule injection. Current Component 04 enforcement uses a separate direct ovs-ofctl adapter over OpenFlow 1.3; controller compatibility and end-to-end integration remain to be validated.</w:t>
       </w:r>
     </w:p>
     <w:p>
@@ -2121,7 +2134,7 @@
               <w:rPr>
                 <w:b/>
               </w:rPr>
-              <w:t>SDNMitigationController</w:t>
+              <w:t>OVSEnforcer</w:t>
             </w:r>
           </w:p>
         </w:tc>
@@ -2157,9 +2170,13 @@
           </w:tcPr>
           <w:p>
             <w:r>
-              <w:t>attr: ryu_client, ovs_bridge</w:t>
+              <w:t>Current implementation: ovs_enforcement_v2.py</w:t>
               <w:br/>
-              <w:t>method: enforce_meter(flow_id, rate)</w:t>
+              <w:t>attr: services, cookie, meter_id, flow_created, meter_created</w:t>
+              <w:br/>
+              <w:t>methods: apply(recommendation), run(arguments), cleanup()</w:t>
+              <w:br/>
+              <w:t>Direct OVS adapter; Ryu integration planned.</w:t>
             </w:r>
           </w:p>
         </w:tc>
@@ -2198,7 +2215,7 @@
               <w:rPr>
                 <w:b/>
               </w:rPr>
-              <w:t>QoSMonitor</w:t>
+              <w:t>Receiver QoS monitoring modules</w:t>
             </w:r>
           </w:p>
         </w:tc>
@@ -2234,9 +2251,9 @@
           </w:tcPr>
           <w:p>
             <w:r>
-              <w:t>attr: iperf_client, loss_history</w:t>
+              <w:t>Current modules: receiver_window_monitor_v3.py, qos_window_v2.py, qos_review.py, qos_freshness_v2.py and live_qos_bridge_v2.py</w:t>
               <w:br/>
-              <w:t>method: audit_window_delivery(port_5202)</w:t>
+              <w:t>Aggregate receiver intervals; assess QoS; publish fresh context. UDP 5202 is the current sensor test profile.</w:t>
             </w:r>
           </w:p>
         </w:tc>
@@ -2338,6 +2355,31 @@
     </w:tbl>
     <w:p>
       <w:pPr>
+        <w:pStyle w:val="Heading3"/>
+      </w:pPr>
+      <w:r>
+        <w:t>Component 04 Functional Requirements and Verification Boundaries</w:t>
+      </w:r>
+    </w:p>
+    <w:p>
+      <w:r>
+        <w:t>• C04-FR01 — Safe decisions: The policy shall reject unsafe scope overlap with a protected service and return review when required trusted flow or QoS context is missing, stale or invalid. A detector-provided recommendation shall not bypass these checks.</w:t>
+        <w:br/>
+        <w:t>• C04-FR02 — Scoped enforcement: The enforcer shall apply rules only to the validated source, destination, protocol and destination port. For rate limiting, it shall create the meter before its referring flow rule, record command outcomes, and support rollback and cleanup of owned resources. Command completion shall not be presented as measured packet-level activation latency.</w:t>
+        <w:br/>
+        <w:t>• C04-FR03 — Receiver monitoring: The monitor shall aggregate five valid, contiguous receiver intervals into approximately ten-second windows using actual received bytes, elapsed duration and packet counts. Packet loss shall use aggregated counts, not averaged percentages. Measurement timing estimates and freshness shall be retained; unavailable values shall not be interpreted as zero or healthy.</w:t>
+        <w:br/>
+        <w:t>• C04-FR04 — Bounded reassessment: In the current adaptive comparison protocol, the initial 1000 Kbit/s limit follows Window 1; Window 2 is excluded as a transition. Only eligible, fresh, valid Window 3 QoS may trigger one reduction to 500 Kbit/s. If changed, Window 4 is excluded; Window 5 assesses recovery and Window 6 remains the predefined final comparison window. Ineligible reassessment and unexercised branches shall be reported explicitly.</w:t>
+        <w:br/>
+        <w:t>• C04-FR05 — Lifecycle cleanup: The cleanup gate shall require fresh, scope-matched threat-ended evidence and two distinct stable post-threat windows before authorizing removal. Transition, duplicate and stale evidence shall not authorize removal. Only owned rules and meters shall be removed. Harness-generated threat status, explicit lifecycle cleanup, hard-timeout expiry and end-of-test teardown shall be distinguished.</w:t>
+        <w:br/>
+        <w:t>• C04-FR06 — Telemetry and evaluation: The dashboard shall distinguish LIVE, DEMO and REPLAY and retain run identity, provenance and freshness. ICMP reply-arrival RTT shall be labelled as round-trip time, not sensor UDP one-way delay; ICMP sent count and loss remain unavailable without verified send accounting. Matched baseline, static-block and adaptive experiments shall preserve raw logs, configurations and invalid-run reasons. Mock results shall be excluded from empirical live statistics; repeated-run evaluation remains required.</w:t>
+        <w:br/>
+        <w:t>• C04-FR07 — Planned extensions: Real detector integration and Ryu enforcement shall be verified independently. Proposed rerouting requires an alternative network path; quarantine requires an explicitly defined isolation policy or segment. VLANs are an implementation option, not an assumed completed feature. Reconnaissance and MITM decision branches do not establish live detection, mitigation or recovery.</w:t>
+      </w:r>
+    </w:p>
+    <w:p>
+      <w:pPr>
         <w:pStyle w:val="Heading2"/>
       </w:pPr>
       <w:r>
@@ -2354,7 +2396,7 @@
         <w:br/>
         <w:t>• PERF-04 (False Positive Rate): The False Alarm Rate on clean benign traffic shall remain strictly under 0.01% (Achieved at 0.0075%).</w:t>
         <w:br/>
-        <w:t>• PERF-05 (Sensor QoS Preservation): During active DoS/MITM mitigation, medical sensor packet loss on protected UDP port 5202 shall remain at strictly 0.0% with guaranteed delivery above 99.9 Kbit/s.</w:t>
+        <w:t>• PERF-05 (Sensor QoS Evaluation): Component 04 shall measure receiver throughput and UDP packet loss against configurable service thresholds. Initial controlled-testbed targets are throughput ≥90 Kbit/s and UDP loss ≤1% for the ECG profile on UDP 5202. Results shall distinguish valid observations, QoS failures, execution failures and invalid or incomplete measurements. These are experimental acceptance targets, not guaranteed clinical limits. Current main live evidence concerns DoS; MITM and reconnaissance require separate live evaluation.</w:t>
       </w:r>
     </w:p>
     <w:p>
@@ -2367,7 +2409,7 @@
     </w:p>
     <w:p>
       <w:r>
-        <w:t>• Language &amp; Runtime: Python 3.13 for backend microservices; Vanilla JavaScript (ES6+), HTML5, and CSS3 for dashboard frontend.</w:t>
+        <w:t>• Language &amp; Runtime: Python 3.13 for backend microservices; Vanilla JavaScript (ES6+), HTML5, and CSS3 for dashboard frontend. Component 04 currently uses Python 3.13 with direct OVS enforcement; any Ryu adapter shall use an independently validated compatible runtime rather than assume compatibility with this environment.</w:t>
         <w:br/>
         <w:t>• Operating Independence: The system shall run on local CPU threads without requiring hardware-accelerated GPU dependencies.</w:t>
         <w:br/>
@@ -2405,7 +2447,7 @@
     </w:p>
     <w:p>
       <w:r>
-        <w:t>The edge monitoring daemon shall maintain 99.999% availability, auto-restarting upon unexpected shutdown via systemd service configuration.</w:t>
+        <w:t>The edge monitoring daemon shall maintain 99.999% availability, auto-restarting upon unexpected shutdown via systemd service configuration. For Component 04, this is a proposed availability target, not an achieved result; uptime, recovery behaviour and the test observation period must be documented before reporting compliance.</w:t>
       </w:r>
     </w:p>
     <w:p>

</xml_diff>

<commit_message>
docs(IT23368248): add Component 03 formal functional requirements C03-FR01 to FR07 and multi-stage pipeline heuristics
</commit_message>
<xml_diff>
--- a/IT23368248/docs/J26-CS-330_SRS_Document.docx
+++ b/IT23368248/docs/J26-CS-330_SRS_Document.docx
@@ -683,6 +683,17 @@
         <w:rPr>
           <w:sz w:val="20"/>
         </w:rPr>
+        <w:t xml:space="preserve">      Component 03 Functional Requirements &amp; Heuristic Rules (C03-FR01 - FR07)</w:t>
+      </w:r>
+    </w:p>
+    <w:p>
+      <w:pPr>
+        <w:spacing w:line="276" w:lineRule="auto" w:after="40"/>
+      </w:pPr>
+      <w:r>
+        <w:rPr>
+          <w:sz w:val="20"/>
+        </w:rPr>
         <w:t xml:space="preserve">      Component 04 Functional Requirements &amp; Boundaries (C04-FR01 - FR07)</w:t>
       </w:r>
     </w:p>
@@ -851,7 +862,7 @@
         <w:br/>
         <w:t>• Component 02 (Maneth M G B M - IT23326354): DoS detection via SDN flow analysis using an optimized XGBoost classifier to flag volumetric bandwidth floods (UDP, SYN, ICMP, and MQTT Floods) that threaten telemetry availability.</w:t>
         <w:br/>
-        <w:t>• Component 03 (S.M. Dissanayaka - IT23368248): Protocol anomaly detection for stealthy Man-in-the-Middle (MITM) attacks targeting ICU MQTT vital telemetry, utilizing Random Forest inference and deterministic cross-layer correlation within sub-1.2 ms.</w:t>
+        <w:t>• Component 03 (S.M. Dissanayaka - IT23368248): Protocol anomaly detection for stealthy Man-in-the-Middle (MITM) attacks targeting ICU MQTT vital telemetry. Utilizing a 4-stage sequential pipeline, the component executes high-speed IoMT device classification, MQTT telemetry isolation, Random Forest statistical anomaly inference, and Stage 3.5 deterministic cross-layer correlation (ARP poisoning, DNS redirection, and microsecond packet-loss jitter) within an empirically verified 1.15 ms latency, dispatching immediate bedside clinical alerts and non-fatiguing 1050 Hz acoustic warnings.</w:t>
         <w:br/>
         <w:t>• Component 04 (Sahan Wijerathna - IT23306936): Safety-constrained adaptive SDN mitigation and QoS monitoring. The current prototype provides alert validation, trusted-context policy decisions, scoped direct-OVS blocking and rate limiting, receiver-side QoS monitoring, bounded reassessment, owned-rule cleanup and a monitoring dashboard. Main live experiments cover controlled DoS flooding; real detector integration, Ryu enforcement and live reconnaissance/MITM evaluation remain planned.</w:t>
       </w:r>
@@ -1296,6 +1307,45 @@
           </w:p>
         </w:tc>
       </w:tr>
+      <w:tr>
+        <w:tc>
+          <w:tcPr>
+            <w:tcW w:type="dxa" w:w="4680"/>
+            <w:shd w:val="clear" w:color="auto" w:fill="F1F5F9"/>
+            <w:tcMar>
+              <w:top w:w="60" w:type="dxa"/>
+              <w:bottom w:w="60" w:type="dxa"/>
+              <w:left w:w="80" w:type="dxa"/>
+              <w:right w:w="80" w:type="dxa"/>
+            </w:tcMar>
+          </w:tcPr>
+          <w:p>
+            <w:r>
+              <w:rPr>
+                <w:b/>
+              </w:rPr>
+              <w:t>IAT</w:t>
+            </w:r>
+          </w:p>
+        </w:tc>
+        <w:tc>
+          <w:tcPr>
+            <w:tcW w:type="dxa" w:w="4680"/>
+            <w:shd w:val="clear" w:color="auto" w:fill="FFFFFF"/>
+            <w:tcMar>
+              <w:top w:w="60" w:type="dxa"/>
+              <w:bottom w:w="60" w:type="dxa"/>
+              <w:left w:w="80" w:type="dxa"/>
+              <w:right w:w="80" w:type="dxa"/>
+            </w:tcMar>
+          </w:tcPr>
+          <w:p>
+            <w:r>
+              <w:t>Inter-Arrival Time: The time elapsed between the arrival of consecutive network packets; key for detecting MITM delays.</w:t>
+            </w:r>
+          </w:p>
+        </w:tc>
+      </w:tr>
     </w:tbl>
     <w:p>
       <w:pPr>
@@ -1382,9 +1432,9 @@
       <w:r>
         <w:t>The framework provides two primary user-facing interfaces:</w:t>
         <w:br/>
-        <w:t>1. Clinical ICU Bedside Surveillance &amp; Forensics Dashboard: A high-contrast, real-time web portal displaying Digital Bedside Twins, dynamic anomaly probability streams, acoustic 1050 Hz medical alarms, and actionable medical instructions for nursing staff.</w:t>
+        <w:t>1. Clinical ICU Bedside Surveillance &amp; Forensics Dashboard (Component 03): A high-contrast, real-time web portal displaying Digital Bedside Twins, dynamic anomaly probability streams (0.0 to 1.0 sliding window), acoustic 1050 Hz medical alarms, and actionable medical instructions for nursing staff.</w:t>
         <w:br/>
-        <w:t>2. SDN Network Operations Console: A network engineering view visualizing Open vSwitch topology, flow rates, active meter tables, and recorded mitigation history.</w:t>
+        <w:t>2. SDN Network Operations Console (Component 04): A network engineering view visualizing Open vSwitch topology, flow rates, active meter tables, and recorded mitigation history.</w:t>
       </w:r>
     </w:p>
     <w:p>
@@ -1489,7 +1539,7 @@
         <w:br/>
         <w:t>2. DoS Volumetric Flood Detection (Component 02): Analyzes flow rates, packet velocities, and protocol anomalies to separate legitimate high-bandwidth traffic from malicious UDP, SYN, ICMP, and MQTT floods.</w:t>
         <w:br/>
-        <w:t>3. Protocol Anomaly &amp; MITM Confirmation (Component 03): Executes a 4-stage pipeline (IoMT filter -&gt; MQTT filter -&gt; Random Forest inference -&gt; Stage 3.5 deterministic correlation) to detect and confirm stealthy telemetry alterations within 1.15 ms.</w:t>
+        <w:t>3. Protocol Anomaly &amp; MITM Confirmation (Component 03): Executes a multi-stage pipeline (Stage 1 IoMT filter -&gt; Stage 2 MQTT filter -&gt; Stage 3 Random Forest inference -&gt; Stage 3.5 deterministic correlation) to detect and confirm stealthy telemetry alterations within 1.15 ms.</w:t>
         <w:br/>
         <w:t>4. Adaptive SDN Flow Enforcement (Component 04): Validates structured JSON alerts and evaluates trusted flow, protected-service and fresh QoS context to recommend review, rate_limit or block. A separate direct-OVS enforcer applies scoped OpenFlow 1.3 rules and meters. Receiver-side throughput and UDP loss are assessed against configurable experimental thresholds; no zero-loss or clinical delivery guarantee is claimed. The comparison runner controls scenario actions independently of the alert API, so these experiments do not establish real detector-to-enforcement integration.</w:t>
       </w:r>
@@ -1621,13 +1671,13 @@
     </w:p>
     <w:p>
       <w:r>
-        <w:t>• SWI-04 (Component 04 Alert Input): POST /alert shall validate required alert fields and payload bounds, reject duplicate accepted IDs within the documented in-memory cache semantics, and obtain protected-service and trusted flow/QoS context. The response shall report a recommendation, reason and applicable scope. Acceptance or recommendation alone shall not execute switch commands. Detector authentication and a real detector alert contract remain integration requirements.</w:t>
-        <w:br/>
         <w:t>• SWI-01 (Prediction Endpoint): POST /predict — Accepts flow JSON features, executes Stages 1 through 3.5, and returns structured prediction JSON containing 'anomaly_score', 'mitm_confirmation_status', and 'action_recommended'.</w:t>
         <w:br/>
         <w:t>• SWI-02 (Alert Endpoint): GET /alerts — Returns recent timestamped threat alerts for UI consumption.</w:t>
         <w:br/>
         <w:t>• SWI-03 (SDN Controller API): Planned REST interface to a Ryu controller for meter creation and flow rule injection. Current Component 04 enforcement uses a separate direct ovs-ofctl adapter over OpenFlow 1.3; controller compatibility and end-to-end integration remain to be validated.</w:t>
+        <w:br/>
+        <w:t>• SWI-04 (Component 04 Alert Input): POST /alert shall validate required alert fields and payload bounds, reject duplicate accepted IDs within the documented in-memory cache semantics, and obtain protected-service and trusted flow/QoS context. The response shall report a recommendation, reason and applicable scope. Acceptance or recommendation alone shall not execute switch commands. Detector authentication and a real detector alert contract remain integration requirements.</w:t>
       </w:r>
     </w:p>
     <w:p>
@@ -2358,7 +2408,38 @@
         <w:pStyle w:val="Heading3"/>
       </w:pPr>
       <w:r>
-        <w:t>Component 04 Functional Requirements and Verification Boundaries</w:t>
+        <w:t>Component 03 Functional Requirements and Heuristic Rules (S.M. Dissanayaka)</w:t>
+      </w:r>
+    </w:p>
+    <w:p>
+      <w:r>
+        <w:t>• C03-FR01 — Stage 1 IoMT Ingestion Filter: The system shall classify incoming raw packets against verified healthcare MAC/IP profiles and device fingerprints. Traffic from non-medical hosts (such as hospital office PCs or visitor Wi-Fi) shall be tagged as Non-IoMT and bypassed, filtering approximately 85% of background noise to conserve edge gateway compute resources.</w:t>
+        <w:br/>
+        <w:t>• C03-FR02 — Stage 2 MQTT Protocol Heuristic: The filter shall inspect validated IoMT flows for standard and secure MQTT protocol profiles operating over TCP Port 1883 and Port 8883. Non-telemetry flows (e.g., HTTP, DNS) shall be categorized as Non-MQTT, isolating life-critical physiological vital sign streams for downstream inspection.</w:t>
+        <w:br/>
+        <w:t>• C03-FR03 — Stage 3 Random Forest Anomaly Scoring: The ML engine shall compute a continuous Anomaly Probability Score (0.0 to 1.0) for each MQTT flow based on Flow Inter-Arrival Time (IAT) variance, TCP Window size dynamics, and packet length deviations. Scores between 0.00–0.20 represent compliant baseline telemetry, while scores exceeding the empirical 0.65 threshold transition the flow into a Suspicious state.</w:t>
+        <w:br/>
+        <w:t>• C03-FR04 — Stage 3.5 Deterministic MITM Correlation: Upon a suspicious ML score, the engine shall cross-correlate network state data to confirm true Man-in-the-Middle wiretaps and prevent false alarms caused by normal Wi-Fi jitter. The heuristic shall check three deterministic vectors:</w:t>
+        <w:br/>
+        <w:t xml:space="preserve">    1. Vector 1 (ARP Cache Poisoning): Detect conflicting MAC-to-IP bindings or gratuitous ARP flood bursts.</w:t>
+        <w:br/>
+        <w:t xml:space="preserve">    2. Vector 2 (DNS Redirection Spoofing): Detect altered broker resolution queries redirecting telemetry to unauthorized proxy IP addresses.</w:t>
+        <w:br/>
+        <w:t xml:space="preserve">    3. Vector 3 (Payload Tampering &amp; Sequence Anomaly): Detect altered message byte variances and TCP sequence offsets while packet syntax remains valid.</w:t>
+        <w:br/>
+        <w:t>• C03-FR05 — Sub-1.2 ms Pipeline Latency: The complete detection sequence (Stage 1 through Stage 3.5) shall finish within a verified mean latency of 1.15 ms per flow on edge CPU architectures, operating well within the ICU sub-10 ms real-time safety constraint.</w:t>
+        <w:br/>
+        <w:t>• C03-FR06 — Bedside Clinical Triage &amp; Acoustic Alerting: Confirmed MITM events shall immediately trigger bedside visual state transitions (Digital Twins flashing red), display exact numerical vital sign deltas (e.g., Safe 2.0 units/hr vs Injected 25.0 units/hr), and synthesize an IEC 60601-1-8 compliant 1050 Hz acoustic warning chime via the Web Audio API without inducing nurse alarm fatigue.</w:t>
+        <w:br/>
+        <w:t>• C03-FR07 — Non-Intrusive Decoupled Safety: The component shall operate strictly out-of-band via passive SPAN port mirroring. The system shall never install background daemons on physical medical devices, and shall never directly drop switch packets or sever physical cables. Recommended mitigation actions shall be dispatched solely as structured JSON payloads to Component 04.</w:t>
+      </w:r>
+    </w:p>
+    <w:p>
+      <w:pPr>
+        <w:pStyle w:val="Heading3"/>
+      </w:pPr>
+      <w:r>
+        <w:t>Component 04 Functional Requirements and Verification Boundaries (Sahan Wijerathna)</w:t>
       </w:r>
     </w:p>
     <w:p>

</xml_diff>